<commit_message>
Caption edits use fresh doc state; exports prefer project-local templates
Co-Authored-By: Claude Fable 5 <noreply@anthropic.com>
</commit_message>
<xml_diff>
--- a/templates/reference-grants-compact.docx
+++ b/templates/reference-grants-compact.docx
@@ -1,273 +1,402 @@
 
 <file path=word/document.xml><?xml version="1.0" encoding="utf-8"?>
-<w:document xmlns:w="http://schemas.openxmlformats.org/wordprocessingml/2006/main" xmlns:m="http://schemas.openxmlformats.org/officeDocument/2006/math" xmlns:r="http://schemas.openxmlformats.org/officeDocument/2006/relationships" xmlns:o="urn:schemas-microsoft-com:office:office" xmlns:v="urn:schemas-microsoft-com:vml" xmlns:w10="urn:schemas-microsoft-com:office:word" xmlns:a="http://schemas.openxmlformats.org/drawingml/2006/main" xmlns:pic="http://schemas.openxmlformats.org/drawingml/2006/picture" xmlns:wp="http://schemas.openxmlformats.org/drawingml/2006/wordprocessingDrawing">
+<w:document xmlns:wpc="http://schemas.microsoft.com/office/word/2010/wordprocessingCanvas" xmlns:cx="http://schemas.microsoft.com/office/drawing/2014/chartex" xmlns:cx1="http://schemas.microsoft.com/office/drawing/2015/9/8/chartex" xmlns:cx2="http://schemas.microsoft.com/office/drawing/2015/10/21/chartex" xmlns:cx3="http://schemas.microsoft.com/office/drawing/2016/5/9/chartex" xmlns:cx4="http://schemas.microsoft.com/office/drawing/2016/5/10/chartex" xmlns:cx5="http://schemas.microsoft.com/office/drawing/2016/5/11/chartex" xmlns:cx6="http://schemas.microsoft.com/office/drawing/2016/5/12/chartex" xmlns:cx7="http://schemas.microsoft.com/office/drawing/2016/5/13/chartex" xmlns:cx8="http://schemas.microsoft.com/office/drawing/2016/5/14/chartex" xmlns:mc="http://schemas.openxmlformats.org/markup-compatibility/2006" xmlns:m="http://schemas.openxmlformats.org/officeDocument/2006/math" xmlns:aink="http://schemas.microsoft.com/office/drawing/2016/ink" xmlns:am3d="http://schemas.microsoft.com/office/drawing/2017/model3d" xmlns:oel="http://schemas.microsoft.com/office/2019/extlst" xmlns:r="http://schemas.openxmlformats.org/officeDocument/2006/relationships" xmlns:wp14="http://schemas.microsoft.com/office/word/2010/wordprocessingDrawing" xmlns:wp="http://schemas.openxmlformats.org/drawingml/2006/wordprocessingDrawing" xmlns:wpg="http://schemas.microsoft.com/office/word/2010/wordprocessingGroup" xmlns:wpi="http://schemas.microsoft.com/office/word/2010/wordprocessingInk" xmlns:wps="http://schemas.microsoft.com/office/word/2010/wordprocessingShape" xmlns:o="urn:schemas-microsoft-com:office:office" xmlns:v="urn:schemas-microsoft-com:vml" xmlns:w10="urn:schemas-microsoft-com:office:word" xmlns:w="http://schemas.openxmlformats.org/wordprocessingml/2006/main" xmlns:w14="http://schemas.microsoft.com/office/word/2010/wordml" xmlns:w15="http://schemas.microsoft.com/office/word/2012/wordml" xmlns:w16cex="http://schemas.microsoft.com/office/word/2018/wordml/cex" xmlns:w16cid="http://schemas.microsoft.com/office/word/2016/wordml/cid" xmlns:w16="http://schemas.microsoft.com/office/word/2018/wordml" xmlns:w16sdtdh="http://schemas.microsoft.com/office/word/2020/wordml/sdtdatahash" xmlns:w16sdtfl="http://schemas.microsoft.com/office/word/2024/wordml/sdtformatlock" xmlns:w16se="http://schemas.microsoft.com/office/word/2015/wordml/symex" xmlns:w16du="http://schemas.microsoft.com/office/word/2023/wordml/word16du" xmlns:wne="http://schemas.microsoft.com/office/word/2006/wordml" mc:Ignorable="w14 w15 w16se w16cid w16 w16cex w16sdtdh w16sdtfl w16du wp14">
   <w:body>
     <w:p>
       <w:pPr>
         <w:pStyle w:val="Title"/>
-      </w:pPr>
-      <w:r>
-        <w:t xml:space="preserve">Title</w:t>
+        <w:rPr>
+          <w:color w:val="000000" w:themeColor="text1"/>
+        </w:rPr>
+      </w:pPr>
+      <w:r>
+        <w:rPr>
+          <w:color w:val="000000" w:themeColor="text1"/>
+        </w:rPr>
+        <w:t>Title</w:t>
       </w:r>
     </w:p>
     <w:p>
       <w:pPr>
         <w:pStyle w:val="Subtitle"/>
-      </w:pPr>
-      <w:r>
-        <w:t xml:space="preserve">Subtitle</w:t>
+        <w:rPr>
+          <w:color w:val="000000" w:themeColor="text1"/>
+        </w:rPr>
+      </w:pPr>
+      <w:r>
+        <w:rPr>
+          <w:color w:val="000000" w:themeColor="text1"/>
+        </w:rPr>
+        <w:t>Subtitle</w:t>
       </w:r>
     </w:p>
     <w:p>
       <w:pPr>
         <w:pStyle w:val="Author"/>
-      </w:pPr>
-      <w:r>
-        <w:t xml:space="preserve">Author</w:t>
+        <w:rPr>
+          <w:color w:val="000000" w:themeColor="text1"/>
+        </w:rPr>
+      </w:pPr>
+      <w:r>
+        <w:rPr>
+          <w:color w:val="000000" w:themeColor="text1"/>
+        </w:rPr>
+        <w:t>Author</w:t>
       </w:r>
     </w:p>
     <w:p>
       <w:pPr>
         <w:pStyle w:val="Date"/>
-      </w:pPr>
-      <w:r>
-        <w:t xml:space="preserve">Date</w:t>
+        <w:rPr>
+          <w:color w:val="000000" w:themeColor="text1"/>
+        </w:rPr>
+      </w:pPr>
+      <w:r>
+        <w:rPr>
+          <w:color w:val="000000" w:themeColor="text1"/>
+        </w:rPr>
+        <w:t>Date</w:t>
       </w:r>
     </w:p>
     <w:p>
       <w:pPr>
         <w:pStyle w:val="Abstract"/>
-      </w:pPr>
-      <w:r>
-        <w:t xml:space="preserve">Abstract</w:t>
+        <w:rPr>
+          <w:color w:val="000000" w:themeColor="text1"/>
+        </w:rPr>
+      </w:pPr>
+      <w:r>
+        <w:rPr>
+          <w:color w:val="000000" w:themeColor="text1"/>
+        </w:rPr>
+        <w:t>Abstract</w:t>
       </w:r>
     </w:p>
     <w:p>
       <w:pPr>
         <w:pStyle w:val="Heading1"/>
-      </w:pPr>
-      <w:bookmarkStart w:id="21" w:name="heading-1"/>
-      <w:r>
-        <w:t xml:space="preserve">Heading 1</w:t>
-      </w:r>
-      <w:bookmarkEnd w:id="21"/>
+        <w:rPr>
+          <w:color w:val="000000" w:themeColor="text1"/>
+        </w:rPr>
+      </w:pPr>
+      <w:bookmarkStart w:id="0" w:name="heading-1"/>
+      <w:r>
+        <w:rPr>
+          <w:color w:val="000000" w:themeColor="text1"/>
+        </w:rPr>
+        <w:t>Heading 1</w:t>
+      </w:r>
+      <w:bookmarkEnd w:id="0"/>
     </w:p>
     <w:p>
       <w:pPr>
         <w:pStyle w:val="Heading2"/>
-      </w:pPr>
-      <w:bookmarkStart w:id="22" w:name="heading-2"/>
-      <w:r>
-        <w:t xml:space="preserve">Heading 2</w:t>
-      </w:r>
-      <w:bookmarkEnd w:id="22"/>
+        <w:rPr>
+          <w:color w:val="000000" w:themeColor="text1"/>
+        </w:rPr>
+      </w:pPr>
+      <w:bookmarkStart w:id="1" w:name="heading-2"/>
+      <w:r>
+        <w:rPr>
+          <w:color w:val="000000" w:themeColor="text1"/>
+        </w:rPr>
+        <w:t>Heading 2</w:t>
+      </w:r>
+      <w:bookmarkEnd w:id="1"/>
     </w:p>
     <w:p>
       <w:pPr>
         <w:pStyle w:val="Heading3"/>
-      </w:pPr>
-      <w:bookmarkStart w:id="23" w:name="heading-3"/>
-      <w:r>
-        <w:t xml:space="preserve">Heading 3</w:t>
-      </w:r>
-      <w:bookmarkEnd w:id="23"/>
+        <w:rPr>
+          <w:color w:val="000000" w:themeColor="text1"/>
+        </w:rPr>
+      </w:pPr>
+      <w:bookmarkStart w:id="2" w:name="heading-3"/>
+      <w:r>
+        <w:rPr>
+          <w:color w:val="000000" w:themeColor="text1"/>
+        </w:rPr>
+        <w:t>Heading 3</w:t>
+      </w:r>
+      <w:bookmarkEnd w:id="2"/>
     </w:p>
     <w:p>
       <w:pPr>
         <w:pStyle w:val="Heading4"/>
-      </w:pPr>
-      <w:bookmarkStart w:id="24" w:name="heading-4"/>
-      <w:r>
-        <w:t xml:space="preserve">Heading 4</w:t>
-      </w:r>
-      <w:bookmarkEnd w:id="24"/>
+        <w:rPr>
+          <w:color w:val="000000" w:themeColor="text1"/>
+        </w:rPr>
+      </w:pPr>
+      <w:bookmarkStart w:id="3" w:name="heading-4"/>
+      <w:r>
+        <w:rPr>
+          <w:color w:val="000000" w:themeColor="text1"/>
+        </w:rPr>
+        <w:t>Heading 4</w:t>
+      </w:r>
+      <w:bookmarkEnd w:id="3"/>
     </w:p>
     <w:p>
       <w:pPr>
         <w:pStyle w:val="Heading5"/>
-      </w:pPr>
-      <w:bookmarkStart w:id="25" w:name="heading-5"/>
-      <w:r>
-        <w:t xml:space="preserve">Heading 5</w:t>
-      </w:r>
-      <w:bookmarkEnd w:id="25"/>
+        <w:rPr>
+          <w:color w:val="000000" w:themeColor="text1"/>
+        </w:rPr>
+      </w:pPr>
+      <w:bookmarkStart w:id="4" w:name="heading-5"/>
+      <w:r>
+        <w:rPr>
+          <w:color w:val="000000" w:themeColor="text1"/>
+        </w:rPr>
+        <w:t>Heading 5</w:t>
+      </w:r>
+      <w:bookmarkEnd w:id="4"/>
     </w:p>
     <w:p>
       <w:pPr>
         <w:pStyle w:val="Heading6"/>
-      </w:pPr>
-      <w:bookmarkStart w:id="26" w:name="heading-6"/>
-      <w:r>
-        <w:t xml:space="preserve">Heading 6</w:t>
-      </w:r>
-      <w:bookmarkEnd w:id="26"/>
+        <w:rPr>
+          <w:color w:val="000000" w:themeColor="text1"/>
+        </w:rPr>
+      </w:pPr>
+      <w:bookmarkStart w:id="5" w:name="heading-6"/>
+      <w:r>
+        <w:rPr>
+          <w:color w:val="000000" w:themeColor="text1"/>
+        </w:rPr>
+        <w:t>Heading 6</w:t>
+      </w:r>
+      <w:bookmarkEnd w:id="5"/>
     </w:p>
     <w:p>
       <w:pPr>
         <w:pStyle w:val="Heading7"/>
-      </w:pPr>
-      <w:bookmarkStart w:id="27" w:name="heading-7"/>
-      <w:r>
-        <w:t xml:space="preserve">Heading 7</w:t>
-      </w:r>
-      <w:bookmarkEnd w:id="27"/>
+        <w:rPr>
+          <w:color w:val="000000" w:themeColor="text1"/>
+        </w:rPr>
+      </w:pPr>
+      <w:bookmarkStart w:id="6" w:name="heading-7"/>
+      <w:r>
+        <w:rPr>
+          <w:color w:val="000000" w:themeColor="text1"/>
+        </w:rPr>
+        <w:t>Heading 7</w:t>
+      </w:r>
+      <w:bookmarkEnd w:id="6"/>
     </w:p>
     <w:p>
       <w:pPr>
         <w:pStyle w:val="Heading8"/>
-      </w:pPr>
-      <w:bookmarkStart w:id="28" w:name="heading-8"/>
-      <w:r>
-        <w:t xml:space="preserve">Heading 8</w:t>
-      </w:r>
-      <w:bookmarkEnd w:id="28"/>
+        <w:rPr>
+          <w:color w:val="000000" w:themeColor="text1"/>
+        </w:rPr>
+      </w:pPr>
+      <w:bookmarkStart w:id="7" w:name="heading-8"/>
+      <w:r>
+        <w:rPr>
+          <w:color w:val="000000" w:themeColor="text1"/>
+        </w:rPr>
+        <w:t>Heading 8</w:t>
+      </w:r>
+      <w:bookmarkEnd w:id="7"/>
     </w:p>
     <w:p>
       <w:pPr>
         <w:pStyle w:val="Heading9"/>
-      </w:pPr>
-      <w:bookmarkStart w:id="29" w:name="heading-9"/>
-      <w:r>
-        <w:t xml:space="preserve">Heading 9</w:t>
-      </w:r>
-      <w:bookmarkEnd w:id="29"/>
+        <w:rPr>
+          <w:color w:val="000000" w:themeColor="text1"/>
+        </w:rPr>
+      </w:pPr>
+      <w:bookmarkStart w:id="8" w:name="heading-9"/>
+      <w:r>
+        <w:rPr>
+          <w:color w:val="000000" w:themeColor="text1"/>
+        </w:rPr>
+        <w:t>Heading 9</w:t>
+      </w:r>
+      <w:bookmarkEnd w:id="8"/>
     </w:p>
     <w:p>
       <w:pPr>
         <w:pStyle w:val="FirstParagraph"/>
-      </w:pPr>
-      <w:r>
-        <w:t xml:space="preserve">First Paragraph.</w:t>
+        <w:rPr>
+          <w:color w:val="000000" w:themeColor="text1"/>
+        </w:rPr>
+      </w:pPr>
+      <w:r>
+        <w:rPr>
+          <w:color w:val="000000" w:themeColor="text1"/>
+        </w:rPr>
+        <w:t>First Paragraph.</w:t>
       </w:r>
     </w:p>
     <w:p>
       <w:pPr>
         <w:pStyle w:val="BodyText"/>
-      </w:pPr>
-      <w:r>
-        <w:t xml:space="preserve">Body Text. Body Text Char.</w:t>
-      </w:r>
-      <w:r>
-        <w:t xml:space="preserve"> </w:t>
+        <w:rPr>
+          <w:color w:val="000000" w:themeColor="text1"/>
+        </w:rPr>
+      </w:pPr>
+      <w:r>
+        <w:rPr>
+          <w:color w:val="000000" w:themeColor="text1"/>
+        </w:rPr>
+        <w:t xml:space="preserve">Body Text. Body Text Char. </w:t>
       </w:r>
       <w:r>
         <w:rPr>
           <w:rStyle w:val="VerbatimChar"/>
-        </w:rPr>
-        <w:t xml:space="preserve">Verbatim Char</w:t>
-      </w:r>
-      <w:r>
-        <w:t xml:space="preserve">.</w:t>
-      </w:r>
-      <w:r>
-        <w:t xml:space="preserve"> </w:t>
-      </w:r>
-      <w:hyperlink r:id="rId30">
+          <w:color w:val="000000" w:themeColor="text1"/>
+        </w:rPr>
+        <w:t>Verbatim Char</w:t>
+      </w:r>
+      <w:r>
+        <w:rPr>
+          <w:color w:val="000000" w:themeColor="text1"/>
+        </w:rPr>
+        <w:t xml:space="preserve">. </w:t>
+      </w:r>
+      <w:hyperlink r:id="rId7">
         <w:r>
           <w:rPr>
             <w:rStyle w:val="Hyperlink"/>
+            <w:color w:val="000000" w:themeColor="text1"/>
           </w:rPr>
-          <w:t xml:space="preserve">Hyperlink</w:t>
+          <w:t>Hyperlink</w:t>
         </w:r>
       </w:hyperlink>
       <w:r>
-        <w:t xml:space="preserve">.</w:t>
-      </w:r>
-      <w:r>
-        <w:t xml:space="preserve"> </w:t>
-      </w:r>
-      <w:r>
-        <w:t xml:space="preserve">Footnote.</w:t>
+        <w:rPr>
+          <w:color w:val="000000" w:themeColor="text1"/>
+        </w:rPr>
+        <w:t>. Footnote.</w:t>
       </w:r>
       <w:r>
         <w:rPr>
           <w:rStyle w:val="FootnoteReference"/>
-        </w:rPr>
-        <w:footnoteReference w:id="31"/>
+          <w:color w:val="000000" w:themeColor="text1"/>
+        </w:rPr>
+        <w:footnoteReference w:id="1"/>
       </w:r>
     </w:p>
     <w:p>
       <w:pPr>
         <w:pStyle w:val="BlockText"/>
-      </w:pPr>
-      <w:r>
-        <w:t xml:space="preserve">Block Text.</w:t>
+        <w:rPr>
+          <w:color w:val="000000" w:themeColor="text1"/>
+        </w:rPr>
+      </w:pPr>
+      <w:r>
+        <w:rPr>
+          <w:color w:val="000000" w:themeColor="text1"/>
+        </w:rPr>
+        <w:t>Block Text.</w:t>
       </w:r>
     </w:p>
     <w:p>
       <w:pPr>
         <w:pStyle w:val="TableCaption"/>
-      </w:pPr>
-      <w:r>
-        <w:t xml:space="preserve">Table caption.</w:t>
+        <w:rPr>
+          <w:color w:val="000000" w:themeColor="text1"/>
+        </w:rPr>
+      </w:pPr>
+      <w:r>
+        <w:rPr>
+          <w:color w:val="000000" w:themeColor="text1"/>
+        </w:rPr>
+        <w:t>Table caption.</w:t>
       </w:r>
     </w:p>
     <w:tbl>
       <w:tblPr>
         <w:tblStyle w:val="Table"/>
-        <w:tblLook w:firstRow="1"/>
+        <w:tblW w:w="0" w:type="auto"/>
+        <w:tblLook w:val="07E0" w:firstRow="1" w:lastRow="1" w:firstColumn="1" w:lastColumn="1" w:noHBand="1" w:noVBand="1"/>
         <w:tblCaption w:val="Table caption."/>
       </w:tblPr>
-      <w:tblGrid/>
+      <w:tblGrid>
+        <w:gridCol w:w="717"/>
+        <w:gridCol w:w="717"/>
+      </w:tblGrid>
       <w:tr>
         <w:trPr>
-          <w:cnfStyle w:firstRow="1" w:val="100000000000"/>
+          <w:cnfStyle w:val="100000000000" w:firstRow="1" w:lastRow="0" w:firstColumn="0" w:lastColumn="0" w:oddVBand="0" w:evenVBand="0" w:oddHBand="0" w:evenHBand="0" w:firstRowFirstColumn="0" w:firstRowLastColumn="0" w:lastRowFirstColumn="0" w:lastRowLastColumn="0"/>
         </w:trPr>
         <w:tc>
           <w:tcPr>
-            <w:tcBorders>
-              <w:bottom w:val="single"/>
-            </w:tcBorders>
-            <w:vAlign w:val="bottom"/>
+            <w:tcW w:w="0" w:type="auto"/>
           </w:tcPr>
           <w:p>
             <w:pPr>
               <w:pStyle w:val="Compact"/>
-              <w:jc w:val="left"/>
+              <w:rPr>
+                <w:color w:val="000000" w:themeColor="text1"/>
+              </w:rPr>
             </w:pPr>
             <w:r>
-              <w:t xml:space="preserve">Table</w:t>
+              <w:rPr>
+                <w:color w:val="000000" w:themeColor="text1"/>
+              </w:rPr>
+              <w:t>Table</w:t>
             </w:r>
           </w:p>
         </w:tc>
         <w:tc>
           <w:tcPr>
-            <w:tcBorders>
-              <w:bottom w:val="single"/>
-            </w:tcBorders>
-            <w:vAlign w:val="bottom"/>
+            <w:tcW w:w="0" w:type="auto"/>
           </w:tcPr>
           <w:p>
             <w:pPr>
               <w:pStyle w:val="Compact"/>
-              <w:jc w:val="left"/>
+              <w:rPr>
+                <w:color w:val="000000" w:themeColor="text1"/>
+              </w:rPr>
             </w:pPr>
             <w:r>
-              <w:t xml:space="preserve">Table</w:t>
+              <w:rPr>
+                <w:color w:val="000000" w:themeColor="text1"/>
+              </w:rPr>
+              <w:t>Table</w:t>
             </w:r>
           </w:p>
         </w:tc>
       </w:tr>
       <w:tr>
         <w:tc>
+          <w:tcPr>
+            <w:tcW w:w="0" w:type="auto"/>
+          </w:tcPr>
           <w:p>
             <w:pPr>
               <w:pStyle w:val="Compact"/>
-              <w:jc w:val="left"/>
+              <w:rPr>
+                <w:color w:val="000000" w:themeColor="text1"/>
+              </w:rPr>
             </w:pPr>
             <w:r>
-              <w:t xml:space="preserve">1</w:t>
+              <w:rPr>
+                <w:color w:val="000000" w:themeColor="text1"/>
+              </w:rPr>
+              <w:t>1</w:t>
             </w:r>
           </w:p>
         </w:tc>
         <w:tc>
+          <w:tcPr>
+            <w:tcW w:w="0" w:type="auto"/>
+          </w:tcPr>
           <w:p>
             <w:pPr>
               <w:pStyle w:val="Compact"/>
-              <w:jc w:val="left"/>
+              <w:rPr>
+                <w:color w:val="000000" w:themeColor="text1"/>
+              </w:rPr>
             </w:pPr>
             <w:r>
-              <w:t xml:space="preserve">2</w:t>
+              <w:rPr>
+                <w:color w:val="000000" w:themeColor="text1"/>
+              </w:rPr>
+              <w:t>2</w:t>
             </w:r>
           </w:p>
         </w:tc>
@@ -276,59 +405,113 @@
     <w:p>
       <w:pPr>
         <w:pStyle w:val="ImageCaption"/>
-      </w:pPr>
-      <w:r>
-        <w:t xml:space="preserve">Image Caption</w:t>
+        <w:rPr>
+          <w:color w:val="000000" w:themeColor="text1"/>
+        </w:rPr>
+      </w:pPr>
+      <w:r>
+        <w:rPr>
+          <w:color w:val="000000" w:themeColor="text1"/>
+        </w:rPr>
+        <w:t>Image Caption</w:t>
       </w:r>
     </w:p>
     <w:p>
       <w:pPr>
         <w:pStyle w:val="DefinitionTerm"/>
-      </w:pPr>
-      <w:r>
-        <w:t xml:space="preserve">DefinitionTerm</w:t>
+        <w:rPr>
+          <w:color w:val="000000" w:themeColor="text1"/>
+        </w:rPr>
+      </w:pPr>
+      <w:r>
+        <w:rPr>
+          <w:color w:val="000000" w:themeColor="text1"/>
+        </w:rPr>
+        <w:t>DefinitionTerm</w:t>
       </w:r>
     </w:p>
     <w:p>
       <w:pPr>
         <w:pStyle w:val="Definition"/>
-      </w:pPr>
-      <w:r>
-        <w:t xml:space="preserve">Definition</w:t>
+        <w:rPr>
+          <w:color w:val="000000" w:themeColor="text1"/>
+        </w:rPr>
+      </w:pPr>
+      <w:r>
+        <w:rPr>
+          <w:color w:val="000000" w:themeColor="text1"/>
+        </w:rPr>
+        <w:t>Definition</w:t>
       </w:r>
     </w:p>
     <w:p>
       <w:pPr>
         <w:pStyle w:val="DefinitionTerm"/>
-      </w:pPr>
-      <w:r>
-        <w:t xml:space="preserve">DefinitionTerm</w:t>
+        <w:rPr>
+          <w:color w:val="000000" w:themeColor="text1"/>
+        </w:rPr>
+      </w:pPr>
+      <w:r>
+        <w:rPr>
+          <w:color w:val="000000" w:themeColor="text1"/>
+        </w:rPr>
+        <w:t>DefinitionTerm</w:t>
       </w:r>
     </w:p>
     <w:p>
       <w:pPr>
         <w:pStyle w:val="Definition"/>
-      </w:pPr>
-      <w:r>
-        <w:t xml:space="preserve">Definition</w:t>
+        <w:rPr>
+          <w:color w:val="000000" w:themeColor="text1"/>
+        </w:rPr>
+      </w:pPr>
+      <w:r>
+        <w:rPr>
+          <w:color w:val="000000" w:themeColor="text1"/>
+        </w:rPr>
+        <w:t>Definition</w:t>
       </w:r>
     </w:p>
     <w:sectPr>
       <w:footnotePr>
         <w:numRestart w:val="eachSect"/>
       </w:footnotePr>
-      <w:pgMar w:top="1440" w:bottom="1440" w:left="1440" w:right="1440" w:header="720" w:footer="720"/>
+      <w:pgSz w:w="12240" w:h="15840"/>
+      <w:pgMar w:top="1440" w:right="1440" w:bottom="1440" w:left="1440" w:header="720" w:footer="720" w:gutter="0"/>
+      <w:cols w:space="720"/>
     </w:sectPr>
   </w:body>
 </w:document>
 </file>
 
-<file path=word/comments.xml><?xml version="1.0" encoding="utf-8"?>
-<w:comments xmlns:w="http://schemas.openxmlformats.org/wordprocessingml/2006/main" xmlns:m="http://schemas.openxmlformats.org/officeDocument/2006/math" xmlns:r="http://schemas.openxmlformats.org/officeDocument/2006/relationships" xmlns:o="urn:schemas-microsoft-com:office:office" xmlns:v="urn:schemas-microsoft-com:vml" xmlns:w10="urn:schemas-microsoft-com:office:word" xmlns:a="http://schemas.openxmlformats.org/drawingml/2006/main" xmlns:pic="http://schemas.openxmlformats.org/drawingml/2006/picture" xmlns:wp="http://schemas.openxmlformats.org/drawingml/2006/wordprocessingDrawing"/>
+<file path=word/endnotes.xml><?xml version="1.0" encoding="utf-8"?>
+<w:endnotes xmlns:wpc="http://schemas.microsoft.com/office/word/2010/wordprocessingCanvas" xmlns:cx="http://schemas.microsoft.com/office/drawing/2014/chartex" xmlns:cx1="http://schemas.microsoft.com/office/drawing/2015/9/8/chartex" xmlns:cx2="http://schemas.microsoft.com/office/drawing/2015/10/21/chartex" xmlns:cx3="http://schemas.microsoft.com/office/drawing/2016/5/9/chartex" xmlns:cx4="http://schemas.microsoft.com/office/drawing/2016/5/10/chartex" xmlns:cx5="http://schemas.microsoft.com/office/drawing/2016/5/11/chartex" xmlns:cx6="http://schemas.microsoft.com/office/drawing/2016/5/12/chartex" xmlns:cx7="http://schemas.microsoft.com/office/drawing/2016/5/13/chartex" xmlns:cx8="http://schemas.microsoft.com/office/drawing/2016/5/14/chartex" xmlns:mc="http://schemas.openxmlformats.org/markup-compatibility/2006" xmlns:m="http://schemas.openxmlformats.org/officeDocument/2006/math" xmlns:aink="http://schemas.microsoft.com/office/drawing/2016/ink" xmlns:am3d="http://schemas.microsoft.com/office/drawing/2017/model3d" xmlns:oel="http://schemas.microsoft.com/office/2019/extlst" xmlns:r="http://schemas.openxmlformats.org/officeDocument/2006/relationships" xmlns:wp14="http://schemas.microsoft.com/office/word/2010/wordprocessingDrawing" xmlns:wp="http://schemas.openxmlformats.org/drawingml/2006/wordprocessingDrawing" xmlns:wpg="http://schemas.microsoft.com/office/word/2010/wordprocessingGroup" xmlns:wpi="http://schemas.microsoft.com/office/word/2010/wordprocessingInk" xmlns:wps="http://schemas.microsoft.com/office/word/2010/wordprocessingShape" xmlns:o="urn:schemas-microsoft-com:office:office" xmlns:v="urn:schemas-microsoft-com:vml" xmlns:w10="urn:schemas-microsoft-com:office:word" xmlns:w="http://schemas.openxmlformats.org/wordprocessingml/2006/main" xmlns:w14="http://schemas.microsoft.com/office/word/2010/wordml" xmlns:w15="http://schemas.microsoft.com/office/word/2012/wordml" xmlns:w16cex="http://schemas.microsoft.com/office/word/2018/wordml/cex" xmlns:w16cid="http://schemas.microsoft.com/office/word/2016/wordml/cid" xmlns:w16="http://schemas.microsoft.com/office/word/2018/wordml" xmlns:w16sdtdh="http://schemas.microsoft.com/office/word/2020/wordml/sdtdatahash" xmlns:w16sdtfl="http://schemas.microsoft.com/office/word/2024/wordml/sdtformatlock" xmlns:w16se="http://schemas.microsoft.com/office/word/2015/wordml/symex" xmlns:w16du="http://schemas.microsoft.com/office/word/2023/wordml/word16du" xmlns:wne="http://schemas.microsoft.com/office/word/2006/wordml" mc:Ignorable="w14 w15 w16se w16cid w16 w16cex w16sdtdh w16sdtfl w16du wp14">
+  <w:endnote w:type="separator" w:id="-1">
+    <w:p>
+      <w:r>
+        <w:separator/>
+      </w:r>
+    </w:p>
+  </w:endnote>
+  <w:endnote w:type="continuationSeparator" w:id="0">
+    <w:p>
+      <w:r>
+        <w:continuationSeparator/>
+      </w:r>
+    </w:p>
+  </w:endnote>
+</w:endnotes>
 </file>
 
 <file path=word/footnotes.xml><?xml version="1.0" encoding="utf-8"?>
-<w:footnotes xmlns:w="http://schemas.openxmlformats.org/wordprocessingml/2006/main" xmlns:m="http://schemas.openxmlformats.org/officeDocument/2006/math" xmlns:r="http://schemas.openxmlformats.org/officeDocument/2006/relationships" xmlns:o="urn:schemas-microsoft-com:office:office" xmlns:v="urn:schemas-microsoft-com:vml" xmlns:w10="urn:schemas-microsoft-com:office:word" xmlns:a="http://schemas.openxmlformats.org/drawingml/2006/main" xmlns:pic="http://schemas.openxmlformats.org/drawingml/2006/picture" xmlns:wp="http://schemas.openxmlformats.org/drawingml/2006/wordprocessingDrawing">
+<w:footnotes xmlns:wpc="http://schemas.microsoft.com/office/word/2010/wordprocessingCanvas" xmlns:cx="http://schemas.microsoft.com/office/drawing/2014/chartex" xmlns:cx1="http://schemas.microsoft.com/office/drawing/2015/9/8/chartex" xmlns:cx2="http://schemas.microsoft.com/office/drawing/2015/10/21/chartex" xmlns:cx3="http://schemas.microsoft.com/office/drawing/2016/5/9/chartex" xmlns:cx4="http://schemas.microsoft.com/office/drawing/2016/5/10/chartex" xmlns:cx5="http://schemas.microsoft.com/office/drawing/2016/5/11/chartex" xmlns:cx6="http://schemas.microsoft.com/office/drawing/2016/5/12/chartex" xmlns:cx7="http://schemas.microsoft.com/office/drawing/2016/5/13/chartex" xmlns:cx8="http://schemas.microsoft.com/office/drawing/2016/5/14/chartex" xmlns:mc="http://schemas.openxmlformats.org/markup-compatibility/2006" xmlns:m="http://schemas.openxmlformats.org/officeDocument/2006/math" xmlns:aink="http://schemas.microsoft.com/office/drawing/2016/ink" xmlns:am3d="http://schemas.microsoft.com/office/drawing/2017/model3d" xmlns:oel="http://schemas.microsoft.com/office/2019/extlst" xmlns:r="http://schemas.openxmlformats.org/officeDocument/2006/relationships" xmlns:wp14="http://schemas.microsoft.com/office/word/2010/wordprocessingDrawing" xmlns:wp="http://schemas.openxmlformats.org/drawingml/2006/wordprocessingDrawing" xmlns:wpg="http://schemas.microsoft.com/office/word/2010/wordprocessingGroup" xmlns:wpi="http://schemas.microsoft.com/office/word/2010/wordprocessingInk" xmlns:wps="http://schemas.microsoft.com/office/word/2010/wordprocessingShape" xmlns:o="urn:schemas-microsoft-com:office:office" xmlns:v="urn:schemas-microsoft-com:vml" xmlns:w10="urn:schemas-microsoft-com:office:word" xmlns:w="http://schemas.openxmlformats.org/wordprocessingml/2006/main" xmlns:w14="http://schemas.microsoft.com/office/word/2010/wordml" xmlns:w15="http://schemas.microsoft.com/office/word/2012/wordml" xmlns:w16cex="http://schemas.microsoft.com/office/word/2018/wordml/cex" xmlns:w16cid="http://schemas.microsoft.com/office/word/2016/wordml/cid" xmlns:w16="http://schemas.microsoft.com/office/word/2018/wordml" xmlns:w16sdtdh="http://schemas.microsoft.com/office/word/2020/wordml/sdtdatahash" xmlns:w16sdtfl="http://schemas.microsoft.com/office/word/2024/wordml/sdtformatlock" xmlns:w16se="http://schemas.microsoft.com/office/word/2015/wordml/symex" xmlns:w16du="http://schemas.microsoft.com/office/word/2023/wordml/word16du" xmlns:wne="http://schemas.microsoft.com/office/word/2006/wordml" mc:Ignorable="w14 w15 w16se w16cid w16 w16cex w16sdtdh w16sdtfl w16du wp14">
+  <w:footnote w:type="separator" w:id="-1">
+    <w:p>
+      <w:r>
+        <w:separator/>
+      </w:r>
+    </w:p>
+  </w:footnote>
   <w:footnote w:type="continuationSeparator" w:id="0">
     <w:p>
       <w:r>
@@ -336,14 +519,7 @@
       </w:r>
     </w:p>
   </w:footnote>
-  <w:footnote w:type="separator" w:id="-1">
-    <w:p>
-      <w:r>
-        <w:separator/>
-      </w:r>
-    </w:p>
-  </w:footnote>
-  <w:footnote w:id="31">
+  <w:footnote w:id="1">
     <w:p>
       <w:pPr>
         <w:pStyle w:val="FootnoteText"/>
@@ -371,10 +547,11 @@
 </file>
 
 <file path=word/numbering.xml><?xml version="1.0" encoding="utf-8"?>
-<w:numbering xmlns:w="http://schemas.openxmlformats.org/wordprocessingml/2006/main">
-  <w:abstractNum w:abstractNumId="990">
-    <w:nsid w:val="170cd2de"/>
+<w:numbering xmlns:wpc="http://schemas.microsoft.com/office/word/2010/wordprocessingCanvas" xmlns:cx="http://schemas.microsoft.com/office/drawing/2014/chartex" xmlns:cx1="http://schemas.microsoft.com/office/drawing/2015/9/8/chartex" xmlns:cx2="http://schemas.microsoft.com/office/drawing/2015/10/21/chartex" xmlns:cx3="http://schemas.microsoft.com/office/drawing/2016/5/9/chartex" xmlns:cx4="http://schemas.microsoft.com/office/drawing/2016/5/10/chartex" xmlns:cx5="http://schemas.microsoft.com/office/drawing/2016/5/11/chartex" xmlns:cx6="http://schemas.microsoft.com/office/drawing/2016/5/12/chartex" xmlns:cx7="http://schemas.microsoft.com/office/drawing/2016/5/13/chartex" xmlns:cx8="http://schemas.microsoft.com/office/drawing/2016/5/14/chartex" xmlns:mc="http://schemas.openxmlformats.org/markup-compatibility/2006" xmlns:m="http://schemas.openxmlformats.org/officeDocument/2006/math" xmlns:aink="http://schemas.microsoft.com/office/drawing/2016/ink" xmlns:am3d="http://schemas.microsoft.com/office/drawing/2017/model3d" xmlns:oel="http://schemas.microsoft.com/office/2019/extlst" xmlns:r="http://schemas.openxmlformats.org/officeDocument/2006/relationships" xmlns:wp14="http://schemas.microsoft.com/office/word/2010/wordprocessingDrawing" xmlns:wp="http://schemas.openxmlformats.org/drawingml/2006/wordprocessingDrawing" xmlns:wpg="http://schemas.microsoft.com/office/word/2010/wordprocessingGroup" xmlns:wpi="http://schemas.microsoft.com/office/word/2010/wordprocessingInk" xmlns:wps="http://schemas.microsoft.com/office/word/2010/wordprocessingShape" xmlns:o="urn:schemas-microsoft-com:office:office" xmlns:v="urn:schemas-microsoft-com:vml" xmlns:w10="urn:schemas-microsoft-com:office:word" xmlns:w="http://schemas.openxmlformats.org/wordprocessingml/2006/main" xmlns:w14="http://schemas.microsoft.com/office/word/2010/wordml" xmlns:w15="http://schemas.microsoft.com/office/word/2012/wordml" xmlns:w16cex="http://schemas.microsoft.com/office/word/2018/wordml/cex" xmlns:w16cid="http://schemas.microsoft.com/office/word/2016/wordml/cid" xmlns:w16="http://schemas.microsoft.com/office/word/2018/wordml" xmlns:w16sdtdh="http://schemas.microsoft.com/office/word/2020/wordml/sdtdatahash" xmlns:w16sdtfl="http://schemas.microsoft.com/office/word/2024/wordml/sdtformatlock" xmlns:w16se="http://schemas.microsoft.com/office/word/2015/wordml/symex" xmlns:w16du="http://schemas.microsoft.com/office/word/2023/wordml/word16du" xmlns:wne="http://schemas.microsoft.com/office/word/2006/wordml" mc:Ignorable="w14 w15 w16se w16cid w16 w16cex w16sdtdh w16sdtfl w16du wp14">
+  <w:abstractNum w:abstractNumId="0" w15:restartNumberingAfterBreak="0">
+    <w:nsid w:val="170CD2DE"/>
     <w:multiLevelType w:val="multilevel"/>
+    <w:tmpl w:val="02548E56"/>
     <w:lvl w:ilvl="0">
       <w:numFmt w:val="bullet"/>
       <w:lvlText w:val=" "/>
@@ -475,78 +652,518 @@
       </w:pPr>
     </w:lvl>
   </w:abstractNum>
-  <w:num w:numId="1000">
-    <w:abstractNumId w:val="990"/>
+  <w:num w:numId="1" w16cid:durableId="1070543959">
+    <w:abstractNumId w:val="0"/>
   </w:num>
 </w:numbering>
 </file>
 
 <file path=word/styles.xml><?xml version="1.0" encoding="utf-8"?>
-<w:styles xmlns:r="http://schemas.openxmlformats.org/officeDocument/2006/relationships" xmlns:w="http://schemas.openxmlformats.org/wordprocessingml/2006/main">
+<w:styles xmlns:mc="http://schemas.openxmlformats.org/markup-compatibility/2006" xmlns:r="http://schemas.openxmlformats.org/officeDocument/2006/relationships" xmlns:w="http://schemas.openxmlformats.org/wordprocessingml/2006/main" xmlns:w14="http://schemas.microsoft.com/office/word/2010/wordml" xmlns:w15="http://schemas.microsoft.com/office/word/2012/wordml" xmlns:w16cex="http://schemas.microsoft.com/office/word/2018/wordml/cex" xmlns:w16cid="http://schemas.microsoft.com/office/word/2016/wordml/cid" xmlns:w16="http://schemas.microsoft.com/office/word/2018/wordml" xmlns:w16sdtdh="http://schemas.microsoft.com/office/word/2020/wordml/sdtdatahash" xmlns:w16sdtfl="http://schemas.microsoft.com/office/word/2024/wordml/sdtformatlock" xmlns:w16se="http://schemas.microsoft.com/office/word/2015/wordml/symex" xmlns:w16du="http://schemas.microsoft.com/office/word/2023/wordml/word16du" mc:Ignorable="w14 w15 w16se w16cid w16 w16cex w16sdtdh w16sdtfl w16du">
   <w:docDefaults>
     <w:rPrDefault>
       <w:rPr>
-        <w:rFonts w:cstheme="minorBidi" w:ascii="Times New Roman" w:hAnsi="Times New Roman" w:cs="Times New Roman" w:eastAsia="Times New Roman"/>
+        <w:rFonts w:ascii="Times New Roman" w:eastAsia="Times New Roman" w:hAnsi="Times New Roman" w:cstheme="minorBidi"/>
         <w:sz w:val="22"/>
         <w:szCs w:val="22"/>
         <w:lang w:val="en-US" w:eastAsia="zh-CN" w:bidi="ar-SA"/>
       </w:rPr>
     </w:rPrDefault>
-    <w:pPrDefault>
-      <w:pPr>
-        <w:spacing w:after="0" w:before="0" w:line="240" w:lineRule="auto"/>
-      </w:pPr>
-    </w:pPrDefault>
+    <w:pPrDefault/>
   </w:docDefaults>
-  <w:latentStyles w:defLockedState="0" w:defUIPriority="0" w:defSemiHidden="0" w:defUnhideWhenUsed="0" w:defQFormat="0" w:count="276"/>
+  <w:latentStyles w:defLockedState="0" w:defUIPriority="0" w:defSemiHidden="0" w:defUnhideWhenUsed="0" w:defQFormat="0" w:count="376">
+    <w:lsdException w:name="Normal Table" w:semiHidden="1" w:unhideWhenUsed="1"/>
+    <w:lsdException w:name="Table Simple 1" w:semiHidden="1" w:unhideWhenUsed="1"/>
+    <w:lsdException w:name="Table Simple 2" w:semiHidden="1" w:unhideWhenUsed="1"/>
+    <w:lsdException w:name="Table Simple 3" w:semiHidden="1" w:unhideWhenUsed="1"/>
+    <w:lsdException w:name="Table Classic 1" w:semiHidden="1" w:unhideWhenUsed="1"/>
+    <w:lsdException w:name="Table Classic 2" w:semiHidden="1" w:unhideWhenUsed="1"/>
+    <w:lsdException w:name="Table Classic 3" w:semiHidden="1" w:unhideWhenUsed="1"/>
+    <w:lsdException w:name="Table Classic 4" w:semiHidden="1" w:unhideWhenUsed="1"/>
+    <w:lsdException w:name="Table Colorful 1" w:semiHidden="1" w:unhideWhenUsed="1"/>
+    <w:lsdException w:name="Table Colorful 2" w:semiHidden="1" w:unhideWhenUsed="1"/>
+    <w:lsdException w:name="Table Colorful 3" w:semiHidden="1" w:unhideWhenUsed="1"/>
+    <w:lsdException w:name="Table Columns 1" w:semiHidden="1" w:unhideWhenUsed="1"/>
+    <w:lsdException w:name="Table Columns 2" w:semiHidden="1" w:unhideWhenUsed="1"/>
+    <w:lsdException w:name="Table Columns 3" w:semiHidden="1" w:unhideWhenUsed="1"/>
+    <w:lsdException w:name="Table Columns 4" w:semiHidden="1" w:unhideWhenUsed="1"/>
+    <w:lsdException w:name="Table Columns 5" w:semiHidden="1" w:unhideWhenUsed="1"/>
+    <w:lsdException w:name="Table Grid 1" w:semiHidden="1" w:unhideWhenUsed="1"/>
+    <w:lsdException w:name="Table Grid 2" w:semiHidden="1" w:unhideWhenUsed="1"/>
+    <w:lsdException w:name="Table Grid 3" w:semiHidden="1" w:unhideWhenUsed="1"/>
+    <w:lsdException w:name="Table Grid 4" w:semiHidden="1" w:unhideWhenUsed="1"/>
+    <w:lsdException w:name="Table Grid 5" w:semiHidden="1" w:unhideWhenUsed="1"/>
+    <w:lsdException w:name="Table Grid 6" w:semiHidden="1" w:unhideWhenUsed="1"/>
+    <w:lsdException w:name="Table Grid 7" w:semiHidden="1" w:unhideWhenUsed="1"/>
+    <w:lsdException w:name="Table Grid 8" w:semiHidden="1" w:unhideWhenUsed="1"/>
+    <w:lsdException w:name="Table List 1" w:semiHidden="1" w:unhideWhenUsed="1"/>
+    <w:lsdException w:name="Table List 2" w:semiHidden="1" w:unhideWhenUsed="1"/>
+    <w:lsdException w:name="Table List 3" w:semiHidden="1" w:unhideWhenUsed="1"/>
+    <w:lsdException w:name="Table List 4" w:semiHidden="1" w:unhideWhenUsed="1"/>
+    <w:lsdException w:name="Table List 5" w:semiHidden="1" w:unhideWhenUsed="1"/>
+    <w:lsdException w:name="Table List 6" w:semiHidden="1" w:unhideWhenUsed="1"/>
+    <w:lsdException w:name="Table List 7" w:semiHidden="1" w:unhideWhenUsed="1"/>
+    <w:lsdException w:name="Table List 8" w:semiHidden="1" w:unhideWhenUsed="1"/>
+    <w:lsdException w:name="Table 3D effects 1" w:semiHidden="1" w:unhideWhenUsed="1"/>
+    <w:lsdException w:name="Table 3D effects 2" w:semiHidden="1" w:unhideWhenUsed="1"/>
+    <w:lsdException w:name="Table 3D effects 3" w:semiHidden="1" w:unhideWhenUsed="1"/>
+    <w:lsdException w:name="Table Contemporary" w:semiHidden="1" w:unhideWhenUsed="1"/>
+    <w:lsdException w:name="Table Elegant" w:semiHidden="1" w:unhideWhenUsed="1"/>
+    <w:lsdException w:name="Table Professional" w:semiHidden="1" w:unhideWhenUsed="1"/>
+    <w:lsdException w:name="Table Subtle 1" w:semiHidden="1" w:unhideWhenUsed="1"/>
+    <w:lsdException w:name="Table Subtle 2" w:semiHidden="1" w:unhideWhenUsed="1"/>
+    <w:lsdException w:name="Table Web 1" w:semiHidden="1" w:unhideWhenUsed="1"/>
+    <w:lsdException w:name="Table Web 2" w:semiHidden="1" w:unhideWhenUsed="1"/>
+    <w:lsdException w:name="Table Web 3" w:semiHidden="1" w:unhideWhenUsed="1"/>
+    <w:lsdException w:name="Table Theme" w:semiHidden="1" w:unhideWhenUsed="1"/>
+    <w:lsdException w:name="Light Shading"/>
+    <w:lsdException w:name="Light List"/>
+    <w:lsdException w:name="Light Grid"/>
+    <w:lsdException w:name="Medium Shading 1"/>
+    <w:lsdException w:name="Medium Shading 2"/>
+    <w:lsdException w:name="Medium List 1"/>
+    <w:lsdException w:name="Medium List 2"/>
+    <w:lsdException w:name="Medium Grid 1"/>
+    <w:lsdException w:name="Medium Grid 2"/>
+    <w:lsdException w:name="Medium Grid 3"/>
+    <w:lsdException w:name="Dark List"/>
+    <w:lsdException w:name="Colorful Shading"/>
+    <w:lsdException w:name="Colorful List"/>
+    <w:lsdException w:name="Colorful Grid"/>
+    <w:lsdException w:name="Light Shading Accent 1"/>
+    <w:lsdException w:name="Light List Accent 1"/>
+    <w:lsdException w:name="Light Grid Accent 1"/>
+    <w:lsdException w:name="Medium Shading 1 Accent 1"/>
+    <w:lsdException w:name="Medium Shading 2 Accent 1"/>
+    <w:lsdException w:name="Medium List 1 Accent 1"/>
+    <w:lsdException w:name="Medium List 2 Accent 1"/>
+    <w:lsdException w:name="Medium Grid 1 Accent 1"/>
+    <w:lsdException w:name="Medium Grid 2 Accent 1"/>
+    <w:lsdException w:name="Medium Grid 3 Accent 1"/>
+    <w:lsdException w:name="Dark List Accent 1"/>
+    <w:lsdException w:name="Colorful Shading Accent 1"/>
+    <w:lsdException w:name="Colorful List Accent 1"/>
+    <w:lsdException w:name="Colorful Grid Accent 1"/>
+    <w:lsdException w:name="Light Shading Accent 2"/>
+    <w:lsdException w:name="Light List Accent 2"/>
+    <w:lsdException w:name="Light Grid Accent 2"/>
+    <w:lsdException w:name="Medium Shading 1 Accent 2"/>
+    <w:lsdException w:name="Medium Shading 2 Accent 2"/>
+    <w:lsdException w:name="Medium List 1 Accent 2"/>
+    <w:lsdException w:name="Medium List 2 Accent 2"/>
+    <w:lsdException w:name="Medium Grid 1 Accent 2"/>
+    <w:lsdException w:name="Medium Grid 2 Accent 2"/>
+    <w:lsdException w:name="Medium Grid 3 Accent 2"/>
+    <w:lsdException w:name="Dark List Accent 2"/>
+    <w:lsdException w:name="Colorful Shading Accent 2"/>
+    <w:lsdException w:name="Colorful List Accent 2"/>
+    <w:lsdException w:name="Colorful Grid Accent 2"/>
+    <w:lsdException w:name="Light Shading Accent 3"/>
+    <w:lsdException w:name="Light List Accent 3"/>
+    <w:lsdException w:name="Light Grid Accent 3"/>
+    <w:lsdException w:name="Medium Shading 1 Accent 3"/>
+    <w:lsdException w:name="Medium Shading 2 Accent 3"/>
+    <w:lsdException w:name="Medium List 1 Accent 3"/>
+    <w:lsdException w:name="Medium List 2 Accent 3"/>
+    <w:lsdException w:name="Medium Grid 1 Accent 3"/>
+    <w:lsdException w:name="Medium Grid 2 Accent 3"/>
+    <w:lsdException w:name="Medium Grid 3 Accent 3"/>
+    <w:lsdException w:name="Dark List Accent 3"/>
+    <w:lsdException w:name="Colorful Shading Accent 3"/>
+    <w:lsdException w:name="Colorful List Accent 3"/>
+    <w:lsdException w:name="Colorful Grid Accent 3"/>
+    <w:lsdException w:name="Light Shading Accent 4"/>
+    <w:lsdException w:name="Light List Accent 4"/>
+    <w:lsdException w:name="Light Grid Accent 4"/>
+    <w:lsdException w:name="Medium Shading 1 Accent 4"/>
+    <w:lsdException w:name="Medium Shading 2 Accent 4"/>
+    <w:lsdException w:name="Medium List 1 Accent 4"/>
+    <w:lsdException w:name="Medium List 2 Accent 4"/>
+    <w:lsdException w:name="Medium Grid 1 Accent 4"/>
+    <w:lsdException w:name="Medium Grid 2 Accent 4"/>
+    <w:lsdException w:name="Medium Grid 3 Accent 4"/>
+    <w:lsdException w:name="Dark List Accent 4"/>
+    <w:lsdException w:name="Colorful Shading Accent 4"/>
+    <w:lsdException w:name="Colorful List Accent 4"/>
+    <w:lsdException w:name="Colorful Grid Accent 4"/>
+    <w:lsdException w:name="Light Shading Accent 5"/>
+    <w:lsdException w:name="Light List Accent 5"/>
+    <w:lsdException w:name="Light Grid Accent 5"/>
+    <w:lsdException w:name="Medium Shading 1 Accent 5"/>
+    <w:lsdException w:name="Medium Shading 2 Accent 5"/>
+    <w:lsdException w:name="Medium List 1 Accent 5"/>
+    <w:lsdException w:name="Medium List 2 Accent 5"/>
+    <w:lsdException w:name="Medium Grid 1 Accent 5"/>
+    <w:lsdException w:name="Medium Grid 2 Accent 5"/>
+    <w:lsdException w:name="Medium Grid 3 Accent 5"/>
+    <w:lsdException w:name="Dark List Accent 5"/>
+    <w:lsdException w:name="Colorful Shading Accent 5"/>
+    <w:lsdException w:name="Colorful List Accent 5"/>
+    <w:lsdException w:name="Colorful Grid Accent 5"/>
+    <w:lsdException w:name="Light Shading Accent 6"/>
+    <w:lsdException w:name="Light List Accent 6"/>
+    <w:lsdException w:name="Light Grid Accent 6"/>
+    <w:lsdException w:name="Medium Shading 1 Accent 6"/>
+    <w:lsdException w:name="Medium Shading 2 Accent 6"/>
+    <w:lsdException w:name="Medium List 1 Accent 6"/>
+    <w:lsdException w:name="Medium List 2 Accent 6"/>
+    <w:lsdException w:name="Medium Grid 1 Accent 6"/>
+    <w:lsdException w:name="Medium Grid 2 Accent 6"/>
+    <w:lsdException w:name="Medium Grid 3 Accent 6"/>
+    <w:lsdException w:name="Dark List Accent 6"/>
+    <w:lsdException w:name="Colorful Shading Accent 6"/>
+    <w:lsdException w:name="Colorful List Accent 6"/>
+    <w:lsdException w:name="Colorful Grid Accent 6"/>
+    <w:lsdException w:name="Grid Table 4" w:uiPriority="49"/>
+    <w:lsdException w:name="Grid Table 5 Dark" w:uiPriority="50"/>
+    <w:lsdException w:name="Grid Table 6 Colorful" w:uiPriority="51"/>
+    <w:lsdException w:name="Grid Table 7 Colorful" w:uiPriority="52"/>
+    <w:lsdException w:name="Grid Table 1 Light Accent 1" w:uiPriority="46"/>
+    <w:lsdException w:name="Grid Table 2 Accent 1" w:uiPriority="47"/>
+    <w:lsdException w:name="Grid Table 3 Accent 1" w:uiPriority="48"/>
+    <w:lsdException w:name="Grid Table 4 Accent 1" w:uiPriority="49"/>
+    <w:lsdException w:name="Grid Table 5 Dark Accent 1" w:uiPriority="50"/>
+    <w:lsdException w:name="Grid Table 6 Colorful Accent 1" w:uiPriority="51"/>
+    <w:lsdException w:name="Grid Table 7 Colorful Accent 1" w:uiPriority="52"/>
+    <w:lsdException w:name="Grid Table 1 Light Accent 2" w:uiPriority="46"/>
+    <w:lsdException w:name="Grid Table 2 Accent 2" w:uiPriority="47"/>
+    <w:lsdException w:name="Grid Table 3 Accent 2" w:uiPriority="48"/>
+    <w:lsdException w:name="Grid Table 4 Accent 2" w:uiPriority="49"/>
+    <w:lsdException w:name="Grid Table 5 Dark Accent 2" w:uiPriority="50"/>
+    <w:lsdException w:name="Grid Table 6 Colorful Accent 2" w:uiPriority="51"/>
+    <w:lsdException w:name="Grid Table 7 Colorful Accent 2" w:uiPriority="52"/>
+    <w:lsdException w:name="Grid Table 1 Light Accent 3" w:uiPriority="46"/>
+    <w:lsdException w:name="Grid Table 2 Accent 3" w:uiPriority="47"/>
+    <w:lsdException w:name="Grid Table 3 Accent 3" w:uiPriority="48"/>
+    <w:lsdException w:name="Grid Table 4 Accent 3" w:uiPriority="49"/>
+    <w:lsdException w:name="Grid Table 5 Dark Accent 3" w:uiPriority="50"/>
+    <w:lsdException w:name="Grid Table 6 Colorful Accent 3" w:uiPriority="51"/>
+    <w:lsdException w:name="Grid Table 7 Colorful Accent 3" w:uiPriority="52"/>
+    <w:lsdException w:name="Grid Table 1 Light Accent 4" w:uiPriority="46"/>
+    <w:lsdException w:name="Grid Table 2 Accent 4" w:uiPriority="47"/>
+    <w:lsdException w:name="Grid Table 3 Accent 4" w:uiPriority="48"/>
+    <w:lsdException w:name="Grid Table 4 Accent 4" w:uiPriority="49"/>
+    <w:lsdException w:name="Grid Table 5 Dark Accent 4" w:uiPriority="50"/>
+    <w:lsdException w:name="Grid Table 6 Colorful Accent 4" w:uiPriority="51"/>
+    <w:lsdException w:name="Grid Table 7 Colorful Accent 4" w:uiPriority="52"/>
+    <w:lsdException w:name="Grid Table 1 Light Accent 5" w:uiPriority="46"/>
+    <w:lsdException w:name="Grid Table 2 Accent 5" w:uiPriority="47"/>
+    <w:lsdException w:name="Grid Table 3 Accent 5" w:uiPriority="48"/>
+    <w:lsdException w:name="Grid Table 4 Accent 5" w:uiPriority="49"/>
+    <w:lsdException w:name="Grid Table 5 Dark Accent 5" w:uiPriority="50"/>
+    <w:lsdException w:name="Grid Table 6 Colorful Accent 5" w:uiPriority="51"/>
+    <w:lsdException w:name="Grid Table 7 Colorful Accent 5" w:uiPriority="52"/>
+    <w:lsdException w:name="Grid Table 1 Light Accent 6" w:uiPriority="46"/>
+    <w:lsdException w:name="Grid Table 2 Accent 6" w:uiPriority="47"/>
+    <w:lsdException w:name="Grid Table 3 Accent 6" w:uiPriority="48"/>
+    <w:lsdException w:name="Grid Table 4 Accent 6" w:uiPriority="49"/>
+    <w:lsdException w:name="Grid Table 5 Dark Accent 6" w:uiPriority="50"/>
+    <w:lsdException w:name="Grid Table 6 Colorful Accent 6" w:uiPriority="51"/>
+    <w:lsdException w:name="Grid Table 7 Colorful Accent 6" w:uiPriority="52"/>
+    <w:lsdException w:name="List Table 1 Light" w:uiPriority="46"/>
+    <w:lsdException w:name="List Table 2" w:uiPriority="47"/>
+    <w:lsdException w:name="List Table 3" w:uiPriority="48"/>
+    <w:lsdException w:name="List Table 4" w:uiPriority="49"/>
+    <w:lsdException w:name="List Table 5 Dark" w:uiPriority="50"/>
+    <w:lsdException w:name="List Table 6 Colorful" w:uiPriority="51"/>
+    <w:lsdException w:name="List Table 7 Colorful" w:uiPriority="52"/>
+    <w:lsdException w:name="List Table 1 Light Accent 1" w:uiPriority="46"/>
+    <w:lsdException w:name="List Table 2 Accent 1" w:uiPriority="47"/>
+    <w:lsdException w:name="List Table 3 Accent 1" w:uiPriority="48"/>
+    <w:lsdException w:name="List Table 4 Accent 1" w:uiPriority="49"/>
+    <w:lsdException w:name="List Table 5 Dark Accent 1" w:uiPriority="50"/>
+    <w:lsdException w:name="List Table 6 Colorful Accent 1" w:uiPriority="51"/>
+    <w:lsdException w:name="List Table 7 Colorful Accent 1" w:uiPriority="52"/>
+    <w:lsdException w:name="List Table 1 Light Accent 2" w:uiPriority="46"/>
+    <w:lsdException w:name="List Table 2 Accent 2" w:uiPriority="47"/>
+    <w:lsdException w:name="List Table 3 Accent 2" w:uiPriority="48"/>
+    <w:lsdException w:name="List Table 4 Accent 2" w:uiPriority="49"/>
+    <w:lsdException w:name="List Table 5 Dark Accent 2" w:uiPriority="50"/>
+    <w:lsdException w:name="List Table 6 Colorful Accent 2" w:uiPriority="51"/>
+    <w:lsdException w:name="List Table 7 Colorful Accent 2" w:uiPriority="52"/>
+    <w:lsdException w:name="List Table 1 Light Accent 3" w:uiPriority="46"/>
+    <w:lsdException w:name="List Table 2 Accent 3" w:uiPriority="47"/>
+    <w:lsdException w:name="List Table 3 Accent 3" w:uiPriority="48"/>
+    <w:lsdException w:name="List Table 4 Accent 3" w:uiPriority="49"/>
+    <w:lsdException w:name="List Table 5 Dark Accent 3" w:uiPriority="50"/>
+    <w:lsdException w:name="List Table 6 Colorful Accent 3" w:uiPriority="51"/>
+    <w:lsdException w:name="List Table 7 Colorful Accent 3" w:uiPriority="52"/>
+    <w:lsdException w:name="List Table 1 Light Accent 4" w:uiPriority="46"/>
+    <w:lsdException w:name="List Table 2 Accent 4" w:uiPriority="47"/>
+    <w:lsdException w:name="List Table 3 Accent 4" w:uiPriority="48"/>
+    <w:lsdException w:name="List Table 4 Accent 4" w:uiPriority="49"/>
+    <w:lsdException w:name="List Table 5 Dark Accent 4" w:uiPriority="50"/>
+    <w:lsdException w:name="List Table 6 Colorful Accent 4" w:uiPriority="51"/>
+    <w:lsdException w:name="List Table 7 Colorful Accent 4" w:uiPriority="52"/>
+    <w:lsdException w:name="List Table 1 Light Accent 5" w:uiPriority="46"/>
+    <w:lsdException w:name="List Table 2 Accent 5" w:uiPriority="47"/>
+    <w:lsdException w:name="List Table 3 Accent 5" w:uiPriority="48"/>
+    <w:lsdException w:name="List Table 4 Accent 5" w:uiPriority="49"/>
+    <w:lsdException w:name="List Table 5 Dark Accent 5" w:uiPriority="50"/>
+    <w:lsdException w:name="List Table 6 Colorful Accent 5" w:uiPriority="51"/>
+    <w:lsdException w:name="List Table 7 Colorful Accent 5" w:uiPriority="52"/>
+    <w:lsdException w:name="List Table 1 Light Accent 6" w:uiPriority="46"/>
+    <w:lsdException w:name="List Table 2 Accent 6" w:uiPriority="47"/>
+    <w:lsdException w:name="List Table 3 Accent 6" w:uiPriority="48"/>
+    <w:lsdException w:name="List Table 4 Accent 6" w:uiPriority="49"/>
+    <w:lsdException w:name="List Table 5 Dark Accent 6" w:uiPriority="50"/>
+    <w:lsdException w:name="List Table 6 Colorful Accent 6" w:uiPriority="51"/>
+    <w:lsdException w:name="List Table 7 Colorful Accent 6" w:uiPriority="52"/>
+    <w:lsdException w:name="Mention" w:semiHidden="1" w:uiPriority="99" w:unhideWhenUsed="1"/>
+    <w:lsdException w:name="Smart Hyperlink" w:semiHidden="1" w:uiPriority="99" w:unhideWhenUsed="1"/>
+    <w:lsdException w:name="Hashtag" w:semiHidden="1" w:uiPriority="99" w:unhideWhenUsed="1"/>
+    <w:lsdException w:name="Unresolved Mention" w:semiHidden="1" w:uiPriority="99" w:unhideWhenUsed="1"/>
+    <w:lsdException w:name="Smart Link" w:semiHidden="1" w:uiPriority="99" w:unhideWhenUsed="1"/>
+  </w:latentStyles>
   <w:style w:type="paragraph" w:default="1" w:styleId="Normal">
     <w:name w:val="Normal"/>
     <w:qFormat/>
-    <w:pPr>
-      <w:spacing w:after="0" w:before="0" w:line="240" w:lineRule="auto"/>
-    </w:pPr>
-    <w:rPr>
-      <w:rFonts w:ascii="Times New Roman" w:hAnsi="Times New Roman" w:cs="Times New Roman" w:eastAsia="Times New Roman"/>
-      <w:sz w:val="22"/>
-    </w:rPr>
+    <w:rPr>
+      <w:rFonts w:cs="Times New Roman"/>
+    </w:rPr>
+  </w:style>
+  <w:style w:type="paragraph" w:styleId="Heading1">
+    <w:name w:val="heading 1"/>
+    <w:basedOn w:val="Normal"/>
+    <w:next w:val="BodyText"/>
+    <w:link w:val="Heading1Char"/>
+    <w:uiPriority w:val="9"/>
+    <w:qFormat/>
+    <w:rsid w:val="00A10FD9"/>
+    <w:pPr>
+      <w:keepNext/>
+      <w:keepLines/>
+      <w:spacing w:before="120" w:after="40"/>
+      <w:outlineLvl w:val="0"/>
+    </w:pPr>
+    <w:rPr>
+      <w:rFonts w:cstheme="majorBidi"/>
+      <w:b/>
+      <w:color w:val="0F4761" w:themeColor="accent1" w:themeShade="BF"/>
+      <w:sz w:val="26"/>
+      <w:szCs w:val="40"/>
+    </w:rPr>
+  </w:style>
+  <w:style w:type="paragraph" w:styleId="Heading2">
+    <w:name w:val="heading 2"/>
+    <w:basedOn w:val="Normal"/>
+    <w:next w:val="BodyText"/>
+    <w:link w:val="Heading2Char"/>
+    <w:uiPriority w:val="9"/>
+    <w:semiHidden/>
+    <w:unhideWhenUsed/>
+    <w:qFormat/>
+    <w:rsid w:val="00A10FD9"/>
+    <w:pPr>
+      <w:keepNext/>
+      <w:keepLines/>
+      <w:spacing w:before="120" w:after="40"/>
+      <w:outlineLvl w:val="1"/>
+    </w:pPr>
+    <w:rPr>
+      <w:rFonts w:cstheme="majorBidi"/>
+      <w:b/>
+      <w:color w:val="0F4761" w:themeColor="accent1" w:themeShade="BF"/>
+      <w:sz w:val="24"/>
+      <w:szCs w:val="32"/>
+    </w:rPr>
+  </w:style>
+  <w:style w:type="paragraph" w:styleId="Heading3">
+    <w:name w:val="heading 3"/>
+    <w:basedOn w:val="Normal"/>
+    <w:next w:val="BodyText"/>
+    <w:link w:val="Heading3Char"/>
+    <w:uiPriority w:val="9"/>
+    <w:semiHidden/>
+    <w:unhideWhenUsed/>
+    <w:qFormat/>
+    <w:rsid w:val="00A10FD9"/>
+    <w:pPr>
+      <w:keepNext/>
+      <w:keepLines/>
+      <w:spacing w:before="80" w:after="40"/>
+      <w:outlineLvl w:val="2"/>
+    </w:pPr>
+    <w:rPr>
+      <w:rFonts w:cstheme="majorBidi"/>
+      <w:b/>
+      <w:color w:val="0F4761" w:themeColor="accent1" w:themeShade="BF"/>
+      <w:szCs w:val="28"/>
+    </w:rPr>
+  </w:style>
+  <w:style w:type="paragraph" w:styleId="Heading4">
+    <w:name w:val="heading 4"/>
+    <w:basedOn w:val="Normal"/>
+    <w:next w:val="BodyText"/>
+    <w:link w:val="Heading4Char"/>
+    <w:uiPriority w:val="9"/>
+    <w:semiHidden/>
+    <w:unhideWhenUsed/>
+    <w:qFormat/>
+    <w:rsid w:val="00A10FD9"/>
+    <w:pPr>
+      <w:keepNext/>
+      <w:keepLines/>
+      <w:spacing w:before="80" w:after="40"/>
+      <w:outlineLvl w:val="3"/>
+    </w:pPr>
+    <w:rPr>
+      <w:rFonts w:cstheme="majorBidi"/>
+      <w:b/>
+      <w:i/>
+      <w:iCs/>
+      <w:color w:val="0F4761" w:themeColor="accent1" w:themeShade="BF"/>
+    </w:rPr>
+  </w:style>
+  <w:style w:type="paragraph" w:styleId="Heading5">
+    <w:name w:val="heading 5"/>
+    <w:basedOn w:val="Normal"/>
+    <w:next w:val="BodyText"/>
+    <w:link w:val="Heading5Char"/>
+    <w:uiPriority w:val="9"/>
+    <w:semiHidden/>
+    <w:unhideWhenUsed/>
+    <w:qFormat/>
+    <w:rsid w:val="00A10FD9"/>
+    <w:pPr>
+      <w:keepNext/>
+      <w:keepLines/>
+      <w:spacing w:before="80" w:after="40"/>
+      <w:outlineLvl w:val="4"/>
+    </w:pPr>
+    <w:rPr>
+      <w:rFonts w:cstheme="majorBidi"/>
+      <w:color w:val="0F4761" w:themeColor="accent1" w:themeShade="BF"/>
+    </w:rPr>
+  </w:style>
+  <w:style w:type="paragraph" w:styleId="Heading6">
+    <w:name w:val="heading 6"/>
+    <w:basedOn w:val="Normal"/>
+    <w:next w:val="BodyText"/>
+    <w:link w:val="Heading6Char"/>
+    <w:uiPriority w:val="9"/>
+    <w:semiHidden/>
+    <w:unhideWhenUsed/>
+    <w:qFormat/>
+    <w:rsid w:val="00A10FD9"/>
+    <w:pPr>
+      <w:keepNext/>
+      <w:keepLines/>
+      <w:spacing w:before="40"/>
+      <w:outlineLvl w:val="5"/>
+    </w:pPr>
+    <w:rPr>
+      <w:rFonts w:cstheme="majorBidi"/>
+      <w:i/>
+      <w:iCs/>
+      <w:color w:val="595959" w:themeColor="text1" w:themeTint="A6"/>
+    </w:rPr>
+  </w:style>
+  <w:style w:type="paragraph" w:styleId="Heading7">
+    <w:name w:val="heading 7"/>
+    <w:basedOn w:val="Normal"/>
+    <w:next w:val="BodyText"/>
+    <w:link w:val="Heading7Char"/>
+    <w:uiPriority w:val="9"/>
+    <w:semiHidden/>
+    <w:unhideWhenUsed/>
+    <w:qFormat/>
+    <w:rsid w:val="00A10FD9"/>
+    <w:pPr>
+      <w:keepNext/>
+      <w:keepLines/>
+      <w:spacing w:before="40"/>
+      <w:outlineLvl w:val="6"/>
+    </w:pPr>
+    <w:rPr>
+      <w:rFonts w:cstheme="majorBidi"/>
+      <w:color w:val="595959" w:themeColor="text1" w:themeTint="A6"/>
+    </w:rPr>
+  </w:style>
+  <w:style w:type="paragraph" w:styleId="Heading8">
+    <w:name w:val="heading 8"/>
+    <w:basedOn w:val="Normal"/>
+    <w:next w:val="BodyText"/>
+    <w:link w:val="Heading8Char"/>
+    <w:uiPriority w:val="9"/>
+    <w:semiHidden/>
+    <w:unhideWhenUsed/>
+    <w:qFormat/>
+    <w:rsid w:val="00A10FD9"/>
+    <w:pPr>
+      <w:keepNext/>
+      <w:keepLines/>
+      <w:outlineLvl w:val="7"/>
+    </w:pPr>
+    <w:rPr>
+      <w:rFonts w:cstheme="majorBidi"/>
+      <w:i/>
+      <w:iCs/>
+      <w:color w:val="272727" w:themeColor="text1" w:themeTint="D8"/>
+    </w:rPr>
+  </w:style>
+  <w:style w:type="paragraph" w:styleId="Heading9">
+    <w:name w:val="heading 9"/>
+    <w:basedOn w:val="Normal"/>
+    <w:next w:val="BodyText"/>
+    <w:link w:val="Heading9Char"/>
+    <w:uiPriority w:val="9"/>
+    <w:semiHidden/>
+    <w:unhideWhenUsed/>
+    <w:qFormat/>
+    <w:rsid w:val="00A10FD9"/>
+    <w:pPr>
+      <w:keepNext/>
+      <w:keepLines/>
+      <w:outlineLvl w:val="8"/>
+    </w:pPr>
+    <w:rPr>
+      <w:rFonts w:cstheme="majorBidi"/>
+      <w:color w:val="272727" w:themeColor="text1" w:themeTint="D8"/>
+    </w:rPr>
+  </w:style>
+  <w:style w:type="character" w:default="1" w:styleId="DefaultParagraphFont">
+    <w:name w:val="Default Paragraph Font"/>
+    <w:uiPriority w:val="1"/>
+    <w:semiHidden/>
+    <w:unhideWhenUsed/>
+  </w:style>
+  <w:style w:type="table" w:default="1" w:styleId="TableNormal">
+    <w:name w:val="Normal Table"/>
+    <w:uiPriority w:val="99"/>
+    <w:semiHidden/>
+    <w:unhideWhenUsed/>
+    <w:tblPr>
+      <w:tblInd w:w="0" w:type="dxa"/>
+      <w:tblCellMar>
+        <w:top w:w="0" w:type="dxa"/>
+        <w:left w:w="108" w:type="dxa"/>
+        <w:bottom w:w="0" w:type="dxa"/>
+        <w:right w:w="108" w:type="dxa"/>
+      </w:tblCellMar>
+    </w:tblPr>
+  </w:style>
+  <w:style w:type="numbering" w:default="1" w:styleId="NoList">
+    <w:name w:val="No List"/>
+    <w:uiPriority w:val="99"/>
+    <w:semiHidden/>
+    <w:unhideWhenUsed/>
   </w:style>
   <w:style w:type="paragraph" w:styleId="BodyText">
     <w:name w:val="Body Text"/>
     <w:basedOn w:val="Normal"/>
-    <w:link w:val="BodyTextChar"/>
-    <w:qFormat/>
-    <w:pPr>
-      <w:spacing w:before="0" w:after="0" w:line="240" w:lineRule="auto"/>
-    </w:pPr>
-    <w:rPr>
-      <w:rFonts w:ascii="Times New Roman" w:hAnsi="Times New Roman" w:cs="Times New Roman" w:eastAsia="Times New Roman"/>
-      <w:sz w:val="22"/>
-    </w:rPr>
+    <w:qFormat/>
   </w:style>
   <w:style w:type="paragraph" w:customStyle="1" w:styleId="FirstParagraph">
     <w:name w:val="First Paragraph"/>
     <w:basedOn w:val="BodyText"/>
     <w:next w:val="BodyText"/>
     <w:qFormat/>
-    <w:pPr>
-      <w:spacing w:after="0" w:before="0" w:line="240" w:lineRule="auto"/>
-    </w:pPr>
-    <w:rPr>
-      <w:rFonts w:ascii="Times New Roman" w:hAnsi="Times New Roman" w:cs="Times New Roman" w:eastAsia="Times New Roman"/>
-      <w:sz w:val="22"/>
-    </w:rPr>
   </w:style>
   <w:style w:type="paragraph" w:customStyle="1" w:styleId="Compact">
     <w:name w:val="Compact"/>
     <w:basedOn w:val="BodyText"/>
     <w:qFormat/>
-    <w:pPr>
-      <w:spacing w:before="0" w:after="0" w:line="240" w:lineRule="auto"/>
-    </w:pPr>
-    <w:rPr>
-      <w:rFonts w:ascii="Times New Roman" w:hAnsi="Times New Roman" w:cs="Times New Roman" w:eastAsia="Times New Roman"/>
-      <w:sz w:val="22"/>
-    </w:rPr>
   </w:style>
   <w:style w:type="paragraph" w:styleId="Title">
     <w:name w:val="Title"/>
@@ -557,12 +1174,12 @@
     <w:qFormat/>
     <w:rsid w:val="00A10FD9"/>
     <w:pPr>
-      <w:spacing w:after="80" w:line="240" w:lineRule="auto" w:before="0"/>
+      <w:spacing w:after="80"/>
       <w:contextualSpacing/>
       <w:jc w:val="center"/>
     </w:pPr>
     <w:rPr>
-      <w:rFonts w:cstheme="majorBidi" w:ascii="Times New Roman" w:hAnsi="Times New Roman" w:cs="Times New Roman" w:eastAsia="Times New Roman"/>
+      <w:rFonts w:cstheme="majorBidi"/>
       <w:b/>
       <w:sz w:val="28"/>
       <w:szCs w:val="56"/>
@@ -594,9 +1211,7 @@
       </w:numPr>
     </w:pPr>
     <w:rPr>
-      <w:rFonts w:cstheme="majorBidi"/>
       <w:spacing w:val="15"/>
-      <w:sz w:val="28"/>
       <w:szCs w:val="28"/>
     </w:rPr>
   </w:style>
@@ -650,7 +1265,7 @@
     <w:pPr>
       <w:keepNext/>
       <w:keepLines/>
-      <w:spacing w:before="300" w:after="0"/>
+      <w:spacing w:before="300"/>
       <w:jc w:val="center"/>
     </w:pPr>
     <w:rPr>
@@ -677,214 +1292,7 @@
   <w:style w:type="paragraph" w:styleId="Bibliography">
     <w:name w:val="Bibliography"/>
     <w:basedOn w:val="Normal"/>
-    <w:next w:val="Bibliography"/>
-    <w:qFormat/>
-    <w:pPr/>
-    <w:rPr/>
-  </w:style>
-  <w:style w:type="paragraph" w:styleId="Heading1">
-    <w:name w:val="heading 1"/>
-    <w:basedOn w:val="Normal"/>
-    <w:next w:val="BodyText"/>
-    <w:link w:val="Heading1Char"/>
-    <w:uiPriority w:val="9"/>
-    <w:qFormat/>
-    <w:rsid w:val="00A10FD9"/>
-    <w:pPr>
-      <w:keepNext/>
-      <w:keepLines/>
-      <w:spacing w:before="120" w:after="40" w:line="240" w:lineRule="auto"/>
-      <w:outlineLvl w:val="0"/>
-    </w:pPr>
-    <w:rPr>
-      <w:rFonts w:cstheme="majorBidi" w:ascii="Times New Roman" w:hAnsi="Times New Roman" w:cs="Times New Roman" w:eastAsia="Times New Roman"/>
-      <w:b/>
-      <w:color w:val="0F4761" w:themeColor="accent1" w:themeShade="BF"/>
-      <w:sz w:val="26"/>
-      <w:szCs w:val="40"/>
-    </w:rPr>
-  </w:style>
-  <w:style w:type="paragraph" w:styleId="Heading2">
-    <w:name w:val="heading 2"/>
-    <w:basedOn w:val="Normal"/>
-    <w:next w:val="BodyText"/>
-    <w:link w:val="Heading2Char"/>
-    <w:uiPriority w:val="9"/>
-    <w:semiHidden/>
-    <w:unhideWhenUsed/>
-    <w:qFormat/>
-    <w:rsid w:val="00A10FD9"/>
-    <w:pPr>
-      <w:keepNext/>
-      <w:keepLines/>
-      <w:spacing w:before="120" w:after="40" w:line="240" w:lineRule="auto"/>
-      <w:outlineLvl w:val="1"/>
-    </w:pPr>
-    <w:rPr>
-      <w:rFonts w:cstheme="majorBidi" w:ascii="Times New Roman" w:hAnsi="Times New Roman" w:cs="Times New Roman" w:eastAsia="Times New Roman"/>
-      <w:b/>
-      <w:color w:val="0F4761" w:themeColor="accent1" w:themeShade="BF"/>
-      <w:sz w:val="24"/>
-      <w:szCs w:val="32"/>
-    </w:rPr>
-  </w:style>
-  <w:style w:type="paragraph" w:styleId="Heading3">
-    <w:name w:val="heading 3"/>
-    <w:basedOn w:val="Normal"/>
-    <w:next w:val="BodyText"/>
-    <w:link w:val="Heading3Char"/>
-    <w:uiPriority w:val="9"/>
-    <w:semiHidden/>
-    <w:unhideWhenUsed/>
-    <w:qFormat/>
-    <w:rsid w:val="00A10FD9"/>
-    <w:pPr>
-      <w:keepNext/>
-      <w:keepLines/>
-      <w:spacing w:before="80" w:after="40" w:line="240" w:lineRule="auto"/>
-      <w:outlineLvl w:val="2"/>
-    </w:pPr>
-    <w:rPr>
-      <w:rFonts w:cstheme="majorBidi" w:ascii="Times New Roman" w:hAnsi="Times New Roman" w:cs="Times New Roman" w:eastAsia="Times New Roman"/>
-      <w:b/>
-      <w:color w:val="0F4761" w:themeColor="accent1" w:themeShade="BF"/>
-      <w:sz w:val="22"/>
-      <w:szCs w:val="28"/>
-    </w:rPr>
-  </w:style>
-  <w:style w:type="paragraph" w:styleId="Heading4">
-    <w:name w:val="heading 4"/>
-    <w:basedOn w:val="Normal"/>
-    <w:next w:val="BodyText"/>
-    <w:link w:val="Heading4Char"/>
-    <w:uiPriority w:val="9"/>
-    <w:semiHidden/>
-    <w:unhideWhenUsed/>
-    <w:qFormat/>
-    <w:rsid w:val="00A10FD9"/>
-    <w:pPr>
-      <w:keepNext/>
-      <w:keepLines/>
-      <w:spacing w:before="80" w:after="40" w:line="240" w:lineRule="auto"/>
-      <w:outlineLvl w:val="3"/>
-    </w:pPr>
-    <w:rPr>
-      <w:rFonts w:cstheme="majorBidi" w:ascii="Times New Roman" w:hAnsi="Times New Roman" w:cs="Times New Roman" w:eastAsia="Times New Roman"/>
-      <w:b/>
-      <w:i/>
-      <w:iCs/>
-      <w:color w:val="0F4761" w:themeColor="accent1" w:themeShade="BF"/>
-      <w:sz w:val="22"/>
-    </w:rPr>
-  </w:style>
-  <w:style w:type="paragraph" w:styleId="Heading5">
-    <w:name w:val="heading 5"/>
-    <w:basedOn w:val="Normal"/>
-    <w:next w:val="BodyText"/>
-    <w:link w:val="Heading5Char"/>
-    <w:uiPriority w:val="9"/>
-    <w:semiHidden/>
-    <w:unhideWhenUsed/>
-    <w:qFormat/>
-    <w:rsid w:val="00A10FD9"/>
-    <w:pPr>
-      <w:keepNext/>
-      <w:keepLines/>
-      <w:spacing w:before="80" w:after="40"/>
-      <w:outlineLvl w:val="4"/>
-    </w:pPr>
-    <w:rPr>
-      <w:rFonts w:cstheme="majorBidi"/>
-      <w:color w:val="0F4761" w:themeColor="accent1" w:themeShade="BF"/>
-    </w:rPr>
-  </w:style>
-  <w:style w:type="paragraph" w:styleId="Heading6">
-    <w:name w:val="heading 6"/>
-    <w:basedOn w:val="Normal"/>
-    <w:next w:val="BodyText"/>
-    <w:link w:val="Heading6Char"/>
-    <w:uiPriority w:val="9"/>
-    <w:semiHidden/>
-    <w:unhideWhenUsed/>
-    <w:qFormat/>
-    <w:rsid w:val="00A10FD9"/>
-    <w:pPr>
-      <w:keepNext/>
-      <w:keepLines/>
-      <w:spacing w:before="40" w:after="0"/>
-      <w:outlineLvl w:val="5"/>
-    </w:pPr>
-    <w:rPr>
-      <w:rFonts w:cstheme="majorBidi"/>
-      <w:i/>
-      <w:iCs/>
-      <w:color w:val="595959" w:themeColor="text1" w:themeTint="A6"/>
-    </w:rPr>
-  </w:style>
-  <w:style w:type="paragraph" w:styleId="Heading7">
-    <w:name w:val="heading 7"/>
-    <w:basedOn w:val="Normal"/>
-    <w:next w:val="BodyText"/>
-    <w:link w:val="Heading7Char"/>
-    <w:uiPriority w:val="9"/>
-    <w:semiHidden/>
-    <w:unhideWhenUsed/>
-    <w:qFormat/>
-    <w:rsid w:val="00A10FD9"/>
-    <w:pPr>
-      <w:keepNext/>
-      <w:keepLines/>
-      <w:spacing w:before="40" w:after="0"/>
-      <w:outlineLvl w:val="6"/>
-    </w:pPr>
-    <w:rPr>
-      <w:rFonts w:cstheme="majorBidi"/>
-      <w:color w:val="595959" w:themeColor="text1" w:themeTint="A6"/>
-    </w:rPr>
-  </w:style>
-  <w:style w:type="paragraph" w:styleId="Heading8">
-    <w:name w:val="heading 8"/>
-    <w:basedOn w:val="Normal"/>
-    <w:next w:val="BodyText"/>
-    <w:link w:val="Heading8Char"/>
-    <w:uiPriority w:val="9"/>
-    <w:semiHidden/>
-    <w:unhideWhenUsed/>
-    <w:qFormat/>
-    <w:rsid w:val="00A10FD9"/>
-    <w:pPr>
-      <w:keepNext/>
-      <w:keepLines/>
-      <w:spacing w:after="0"/>
-      <w:outlineLvl w:val="7"/>
-    </w:pPr>
-    <w:rPr>
-      <w:rFonts w:cstheme="majorBidi"/>
-      <w:i/>
-      <w:iCs/>
-      <w:color w:val="272727" w:themeColor="text1" w:themeTint="D8"/>
-    </w:rPr>
-  </w:style>
-  <w:style w:type="paragraph" w:styleId="Heading9">
-    <w:name w:val="heading 9"/>
-    <w:basedOn w:val="Normal"/>
-    <w:next w:val="BodyText"/>
-    <w:link w:val="Heading9Char"/>
-    <w:uiPriority w:val="9"/>
-    <w:semiHidden/>
-    <w:unhideWhenUsed/>
-    <w:qFormat/>
-    <w:rsid w:val="00A10FD9"/>
-    <w:pPr>
-      <w:keepNext/>
-      <w:keepLines/>
-      <w:spacing w:after="0"/>
-      <w:outlineLvl w:val="8"/>
-    </w:pPr>
-    <w:rPr>
-      <w:rFonts w:cstheme="majorBidi"/>
-      <w:color w:val="272727" w:themeColor="text1" w:themeTint="D8"/>
-    </w:rPr>
+    <w:qFormat/>
   </w:style>
   <w:style w:type="character" w:customStyle="1" w:styleId="Heading1Char">
     <w:name w:val="Heading 1 Char"/>
@@ -1013,30 +1421,17 @@
     <w:unhideWhenUsed/>
     <w:qFormat/>
     <w:pPr>
-      <w:spacing w:before="0" w:after="0" w:line="240" w:lineRule="auto"/>
-      <w:ind w:firstLine="0" w:left="480" w:right="480"/>
-    </w:pPr>
-    <w:rPr>
-      <w:rFonts w:ascii="Times New Roman" w:hAnsi="Times New Roman" w:cs="Times New Roman" w:eastAsia="Times New Roman"/>
-      <w:sz w:val="22"/>
-    </w:rPr>
+      <w:ind w:left="480" w:right="480"/>
+    </w:pPr>
   </w:style>
   <w:style w:type="paragraph" w:styleId="FootnoteText">
-    <w:name w:val="Footnote Text"/>
+    <w:name w:val="footnote text"/>
     <w:basedOn w:val="Normal"/>
-    <w:next w:val="FootnoteText"/>
     <w:uiPriority w:val="9"/>
     <w:unhideWhenUsed/>
     <w:qFormat/>
-    <w:pPr>
-      <w:spacing w:after="0" w:before="0" w:line="240" w:lineRule="auto"/>
-    </w:pPr>
-    <w:rPr>
-      <w:rFonts w:ascii="Times New Roman" w:hAnsi="Times New Roman" w:cs="Times New Roman" w:eastAsia="Times New Roman"/>
-      <w:sz w:val="22"/>
-    </w:rPr>
-  </w:style>
-  <w:style w:type="paragraph" w:styleId="FootnoteBlockText">
+  </w:style>
+  <w:style w:type="paragraph" w:customStyle="1" w:styleId="FootnoteBlockText">
     <w:name w:val="Footnote Block Text"/>
     <w:basedOn w:val="FootnoteText"/>
     <w:next w:val="FootnoteText"/>
@@ -1045,17 +1440,11 @@
     <w:qFormat/>
     <w:pPr>
       <w:spacing w:before="100" w:after="100"/>
-      <w:ind w:firstLine="0" w:left="480" w:right="480"/>
-    </w:pPr>
-  </w:style>
-  <w:style w:type="character" w:default="1" w:styleId="DefaultParagraphFont">
-    <w:name w:val="Default Paragraph Font"/>
-    <w:semiHidden/>
-    <w:unhideWhenUsed/>
-  </w:style>
-  <w:style w:type="table" w:default="1" w:styleId="Table">
+      <w:ind w:left="480" w:right="480"/>
+    </w:pPr>
+  </w:style>
+  <w:style w:type="table" w:customStyle="1" w:styleId="Table">
     <w:name w:val="Table"/>
-    <w:basedOn w:val="TableNormal"/>
     <w:semiHidden/>
     <w:unhideWhenUsed/>
     <w:qFormat/>
@@ -1069,9 +1458,10 @@
       </w:tblCellMar>
     </w:tblPr>
     <w:tblStylePr w:type="firstRow">
+      <w:tblPr/>
       <w:tcPr>
         <w:tcBorders>
-          <w:bottom w:val="single"/>
+          <w:bottom w:val="single" w:sz="0" w:space="0" w:color="auto"/>
         </w:tcBorders>
         <w:vAlign w:val="bottom"/>
       </w:tcPr>
@@ -1084,7 +1474,6 @@
     <w:pPr>
       <w:keepNext/>
       <w:keepLines/>
-      <w:spacing w:after="0"/>
     </w:pPr>
     <w:rPr>
       <w:b/>
@@ -1095,11 +1484,11 @@
     <w:basedOn w:val="Normal"/>
   </w:style>
   <w:style w:type="paragraph" w:styleId="Caption">
-    <w:name w:val="Caption"/>
+    <w:name w:val="caption"/>
     <w:basedOn w:val="Normal"/>
-    <w:link w:val="BodyTextChar"/>
-    <w:pPr>
-      <w:spacing w:before="0" w:after="120"/>
+    <w:link w:val="CaptionChar"/>
+    <w:pPr>
+      <w:spacing w:after="120"/>
     </w:pPr>
     <w:rPr>
       <w:i/>
@@ -1127,14 +1516,14 @@
       <w:keepNext/>
     </w:pPr>
   </w:style>
-  <w:style w:type="character" w:customStyle="1" w:styleId="BodyTextChar">
-    <w:name w:val="Body Text Char"/>
+  <w:style w:type="character" w:customStyle="1" w:styleId="CaptionChar">
+    <w:name w:val="Caption Char"/>
     <w:basedOn w:val="DefaultParagraphFont"/>
-    <w:link w:val="BodyText"/>
+    <w:link w:val="Caption"/>
   </w:style>
   <w:style w:type="character" w:customStyle="1" w:styleId="VerbatimChar">
     <w:name w:val="Verbatim Char"/>
-    <w:basedOn w:val="BodyTextChar"/>
+    <w:basedOn w:val="CaptionChar"/>
     <w:rPr>
       <w:rFonts w:ascii="Consolas" w:hAnsi="Consolas"/>
       <w:sz w:val="22"/>
@@ -1142,20 +1531,20 @@
   </w:style>
   <w:style w:type="character" w:customStyle="1" w:styleId="SectionNumber">
     <w:name w:val="Section Number"/>
-    <w:basedOn w:val="BodyTextChar"/>
+    <w:basedOn w:val="CaptionChar"/>
   </w:style>
   <w:style w:type="character" w:styleId="FootnoteReference">
-    <w:name w:val="Footnote Reference"/>
-    <w:basedOn w:val="BodyTextChar"/>
+    <w:name w:val="footnote reference"/>
+    <w:basedOn w:val="CaptionChar"/>
     <w:rPr>
       <w:vertAlign w:val="superscript"/>
     </w:rPr>
   </w:style>
   <w:style w:type="character" w:styleId="Hyperlink">
     <w:name w:val="Hyperlink"/>
-    <w:basedOn w:val="BodyTextChar"/>
-    <w:rPr>
-      <w:color w:val="4F81BD" w:themeColor="accent1"/>
+    <w:basedOn w:val="CaptionChar"/>
+    <w:rPr>
+      <w:color w:val="156082" w:themeColor="accent1"/>
     </w:rPr>
   </w:style>
   <w:style w:type="paragraph" w:styleId="TOCHeading">
@@ -1170,10 +1559,7 @@
       <w:outlineLvl w:val="9"/>
     </w:pPr>
     <w:rPr>
-      <w:rFonts w:cstheme="majorBidi"/>
       <w:b w:val="0"/>
-      <w:bCs w:val="0"/>
-      <w:color w:val="365F91" w:themeColor="accent1" w:themeShade="BF"/>
     </w:rPr>
   </w:style>
 </w:styles>

</xml_diff>